<commit_message>
fix(onlyoffice): Keep image markers across answers and their alt text
The next answer of a conversation names the copies the previous one wrote
by their markers, in the order its blocks are written, until a read, an
undo or a redo. A copy takes the alternative text, name and link of its
original. A selection whose drawings get no marker is not replaced, and
imageCount comes from the read. A link whose text is only an image
marker gives the image alone.
</commit_message>
<xml_diff>
--- a/e2e/fixtures/scribe/img-anchor.docx
+++ b/e2e/fixtures/scribe/img-anchor.docx
@@ -1,6 +1,6 @@
 
 <file path=word/document.xml><?xml version="1.0" encoding="utf-8"?>
-<w:document xmlns:w="http://schemas.openxmlformats.org/wordprocessingml/2006/main" xmlns:r="http://schemas.openxmlformats.org/officeDocument/2006/relationships" xmlns:wp="http://schemas.openxmlformats.org/drawingml/2006/wordprocessingDrawing" xmlns:a="http://schemas.openxmlformats.org/drawingml/2006/main" xmlns:pic="http://schemas.openxmlformats.org/drawingml/2006/picture">
+<w:document xmlns:w="http://schemas.openxmlformats.org/wordprocessingml/2006/main" xmlns:r="http://schemas.openxmlformats.org/officeDocument/2006/relationships" xmlns:wp="http://schemas.openxmlformats.org/drawingml/2006/wordprocessingDrawing" xmlns:a="http://schemas.openxmlformats.org/drawingml/2006/main" xmlns:pic="http://schemas.openxmlformats.org/drawingml/2006/picture" xmlns:wps="http://schemas.microsoft.com/office/word/2010/wordprocessingShape">
   <w:body>
     <w:p>
       <w:r>
@@ -13,7 +13,7 @@
       </w:r>
       <w:r>
         <w:drawing>
-          <wp:anchor distT="0" distB="0" distL="114300" distR="114300" simplePos="0" relativeHeight="251659264" behindDoc="0" locked="0" layoutInCell="1" allowOverlap="1">
+          <wp:anchor distT="0" distB="0" distL="114300" distR="114300" simplePos="0" relativeHeight="251659265" behindDoc="0" locked="0" layoutInCell="1" allowOverlap="1">
             <wp:simplePos x="0" y="0"/>
             <wp:positionH relativeFrom="column">
               <wp:posOffset>3200400</wp:posOffset>
@@ -24,7 +24,7 @@
             <wp:extent cx="457200" cy="457200"/>
             <wp:effectExtent l="0" t="0" r="0" b="0"/>
             <wp:wrapSquare wrapText="bothSides"/>
-            <wp:docPr id="1" name="Picture 1"/>
+            <wp:docPr id="1" name="Picture 1" descr="Team photo"/>
             <wp:cNvGraphicFramePr/>
             <a:graphic xmlns:a="http://schemas.openxmlformats.org/drawingml/2006/main">
               <a:graphicData uri="http://schemas.openxmlformats.org/drawingml/2006/picture">
@@ -61,9 +61,17 @@
       </w:r>
       <w:r>
         <w:drawing>
-          <wp:inline distT="0" distB="0" distL="0" distR="0">
-            <wp:extent cx="457200" cy="457200"/>
-            <wp:effectExtent l="0" t="0" r="0" b="0"/>
+          <wp:anchor distT="0" distB="0" distL="114300" distR="114300" simplePos="0" relativeHeight="251659266" behindDoc="0" locked="0" layoutInCell="1" allowOverlap="1">
+            <wp:simplePos x="0" y="0"/>
+            <wp:positionH relativeFrom="column">
+              <wp:posOffset>0</wp:posOffset>
+            </wp:positionH>
+            <wp:positionV relativeFrom="paragraph">
+              <wp:posOffset>0</wp:posOffset>
+            </wp:positionV>
+            <wp:extent cx="457200" cy="457200"/>
+            <wp:effectExtent l="0" t="0" r="0" b="0"/>
+            <wp:wrapTopAndBottom/>
             <wp:docPr id="2" name="Picture 2"/>
             <wp:cNvGraphicFramePr/>
             <a:graphic xmlns:a="http://schemas.openxmlformats.org/drawingml/2006/main">
@@ -91,7 +99,7 @@
                 </pic:pic>
               </a:graphicData>
             </a:graphic>
-          </wp:inline>
+          </wp:anchor>
         </w:drawing>
       </w:r>
       <w:r>
@@ -134,6 +142,128 @@
       </w:r>
       <w:r>
         <w:t xml:space="preserve"> here.</w:t>
+      </w:r>
+    </w:p>
+    <w:p>
+      <w:r>
+        <w:t xml:space="preserve">Shape </w:t>
+      </w:r>
+      <w:r>
+        <w:drawing>
+          <wp:inline distT="0" distB="0" distL="0" distR="0">
+            <wp:extent cx="457200" cy="228600"/>
+            <wp:effectExtent l="0" t="0" r="0" b="0"/>
+            <wp:docPr id="4" name="Shape 4"/>
+            <wp:cNvGraphicFramePr/>
+            <a:graphic xmlns:a="http://schemas.openxmlformats.org/drawingml/2006/main">
+              <a:graphicData uri="http://schemas.microsoft.com/office/word/2010/wordprocessingShape">
+                <wps:wsp>
+                  <wps:cNvSpPr/>
+                  <wps:spPr>
+                    <a:xfrm>
+                      <a:off x="0" y="0"/>
+                      <a:ext cx="457200" cy="228600"/>
+                    </a:xfrm>
+                    <a:prstGeom prst="rect">
+                      <a:avLst/>
+                    </a:prstGeom>
+                    <a:solidFill>
+                      <a:srgbClr val="4472C4"/>
+                    </a:solidFill>
+                  </wps:spPr>
+                  <wps:bodyPr/>
+                </wps:wsp>
+              </a:graphicData>
+            </a:graphic>
+          </wp:inline>
+        </w:drawing>
+      </w:r>
+      <w:r>
+        <w:t xml:space="preserve"> beside </w:t>
+      </w:r>
+      <w:r>
+        <w:drawing>
+          <wp:inline distT="0" distB="0" distL="0" distR="0">
+            <wp:extent cx="457200" cy="457200"/>
+            <wp:effectExtent l="0" t="0" r="0" b="0"/>
+            <wp:docPr id="5" name="Picture 5"/>
+            <wp:cNvGraphicFramePr/>
+            <a:graphic xmlns:a="http://schemas.openxmlformats.org/drawingml/2006/main">
+              <a:graphicData uri="http://schemas.openxmlformats.org/drawingml/2006/picture">
+                <pic:pic xmlns:pic="http://schemas.openxmlformats.org/drawingml/2006/picture">
+                  <pic:nvPicPr>
+                    <pic:cNvPr id="5" name="Picture 5"/>
+                    <pic:cNvPicPr/>
+                  </pic:nvPicPr>
+                  <pic:blipFill>
+                    <a:blip r:embed="rId2"/>
+                    <a:stretch>
+                      <a:fillRect/>
+                    </a:stretch>
+                  </pic:blipFill>
+                  <pic:spPr>
+                    <a:xfrm>
+                      <a:off x="0" y="0"/>
+                      <a:ext cx="457200" cy="457200"/>
+                    </a:xfrm>
+                    <a:prstGeom prst="rect">
+                      <a:avLst/>
+                    </a:prstGeom>
+                  </pic:spPr>
+                </pic:pic>
+              </a:graphicData>
+            </a:graphic>
+          </wp:inline>
+        </w:drawing>
+      </w:r>
+      <w:r>
+        <w:t xml:space="preserve"> end.</w:t>
+      </w:r>
+    </w:p>
+    <w:p>
+      <w:r>
+        <w:rPr>
+          <w:rFonts w:ascii="Courier New" w:hAnsi="Courier New"/>
+        </w:rPr>
+        <w:t xml:space="preserve">Code </w:t>
+      </w:r>
+      <w:r>
+        <w:rPr>
+          <w:rFonts w:ascii="Courier New" w:hAnsi="Courier New"/>
+        </w:rPr>
+        <w:drawing>
+          <wp:inline distT="0" distB="0" distL="0" distR="0">
+            <wp:extent cx="457200" cy="457200"/>
+            <wp:effectExtent l="0" t="0" r="0" b="0"/>
+            <wp:docPr id="6" name="Picture 6"/>
+            <wp:cNvGraphicFramePr/>
+            <a:graphic xmlns:a="http://schemas.openxmlformats.org/drawingml/2006/main">
+              <a:graphicData uri="http://schemas.openxmlformats.org/drawingml/2006/picture">
+                <pic:pic xmlns:pic="http://schemas.openxmlformats.org/drawingml/2006/picture">
+                  <pic:nvPicPr>
+                    <pic:cNvPr id="6" name="Picture 6"/>
+                    <pic:cNvPicPr/>
+                  </pic:nvPicPr>
+                  <pic:blipFill>
+                    <a:blip r:embed="rId1"/>
+                    <a:stretch>
+                      <a:fillRect/>
+                    </a:stretch>
+                  </pic:blipFill>
+                  <pic:spPr>
+                    <a:xfrm>
+                      <a:off x="0" y="0"/>
+                      <a:ext cx="457200" cy="457200"/>
+                    </a:xfrm>
+                    <a:prstGeom prst="rect">
+                      <a:avLst/>
+                    </a:prstGeom>
+                  </pic:spPr>
+                </pic:pic>
+              </a:graphicData>
+            </a:graphic>
+          </wp:inline>
+        </w:drawing>
       </w:r>
     </w:p>
     <w:p>

</xml_diff>